<commit_message>
fix: precisão jurídica na Seção 7 do Aviso de Direitos Autorais (marca)
Trecho destacado em amarelo na revisão da advogada. A redação anterior
afirmava que nome/logotipo/identidade visual "são de titularidade do
Desenvolvedor" como fato consumado, no mesmo parágrafo que reconhece que o
registro no INPI ainda não aconteceu — contradição interna.

No Brasil, propriedade de marca se adquire pelo registro (art. 129, caput,
Lei 9.279/1996, sistema atributivo). Antes do registro só existe direito de
precedência por uso anterior de boa-fé (art. 129, §1º). Reescrito para
refletir esse estágio: "usados e reivindicados", com a proteção plena
condicionada à conclusão do registro.
</commit_message>
<xml_diff>
--- a/Políticas/Aviso_de_Direitos_Autorais_Campfire_Tradutor.docx
+++ b/Políticas/Aviso_de_Direitos_Autorais_Campfire_Tradutor.docx
@@ -401,7 +401,7 @@
           <w:sz w:val="22"/>
           <w:szCs w:val="22"/>
         </w:rPr>
-        <w:t xml:space="preserve">O nome "Campfire Tradutor", seus logotipos e identidade visual são de titularidade do Desenvolvedor, inclusive frente a versões modificadas do código-fonte aberto (forks) — ver EULA, Seção 7. Uso não autorizado dessas marcas para fins comerciais ou que possa causar confusão sobre a origem do Aplicativo não é permitido. [Atualizar após conclusão do registro da marca no INPI, incluindo o número do processo/registro quando disponível.]</w:t>
+        <w:t xml:space="preserve">O nome "Campfire Tradutor", seus logotipos e identidade visual são usados e reivindicados pelo Desenvolvedor, que pretende formalizar essa proteção por meio de registro junto ao INPI. Até a conclusão desse registro, a proteção decorre do uso e da eventual precedência de que trata o art. 129, §1º, da Lei nº 9.279/1996 (Lei da Propriedade Industrial) — a propriedade plena da marca só se adquire com o registro validamente expedido (art. 129, caput, da mesma lei). Isso se aplica inclusive frente a versões modificadas do código-fonte aberto (forks) — ver EULA, Seção 7. Uso não autorizado desses elementos para fins comerciais ou que possa causar confusão sobre a origem do Aplicativo não é permitido. [Atualizar após conclusão do registro da marca no INPI, incluindo o número do processo/registro quando disponível — a partir daí, a titularidade passa a ser fato consumado.]</w:t>
       </w:r>
     </w:p>
     <w:p>
@@ -644,18 +644,6 @@
     <w:multiLevelType w:val="hybridMultilevel"/>
     <w:lvl w:ilvl="0" w15:tentative="1">
       <w:start w:val="1"/>
-      <w:numFmt w:val="bullet"/>
-      <w:lvlText w:val="•"/>
-      <w:lvlJc w:val="left"/>
-      <w:pPr>
-        <w:ind w:left="504" w:hanging="288"/>
-      </w:pPr>
-    </w:lvl>
-  </w:abstractNum>
-  <w:abstractNum w:abstractNumId="3" w15:restartNumberingAfterBreak="0">
-    <w:multiLevelType w:val="hybridMultilevel"/>
-    <w:lvl w:ilvl="0" w15:tentative="1">
-      <w:start w:val="1"/>
       <w:numFmt w:val="decimal"/>
       <w:lvlText w:val="%1."/>
       <w:lvlJc w:val="left"/>
@@ -671,7 +659,7 @@
     </w:lvlOverride>
   </w:num>
   <w:num w:numId="2">
-    <w:abstractNumId w:val="3"/>
+    <w:abstractNumId w:val="2"/>
     <w:lvlOverride w:ilvl="0">
       <w:startOverride w:val="1"/>
     </w:lvlOverride>

</xml_diff>